<commit_message>
added css to make the forms on the homepage look better
</commit_message>
<xml_diff>
--- a/Planering/it-utrustning_anpassat_2025.docx
+++ b/Planering/it-utrustning_anpassat_2025.docx
@@ -85,9 +85,11 @@
           <w:numId w:val="1"/>
         </w:numPr>
       </w:pPr>
+      <w:proofErr w:type="spellStart"/>
       <w:r>
         <w:t>Switchar</w:t>
       </w:r>
+      <w:proofErr w:type="spellEnd"/>
     </w:p>
     <w:p>
       <w:pPr>
@@ -111,18 +113,33 @@
         <w:t>Servrar</w:t>
       </w:r>
     </w:p>
+    <w:p>
+      <w:pPr>
+        <w:rPr>
+          <w:sz w:val="44"/>
+          <w:szCs w:val="44"/>
+        </w:rPr>
+      </w:pPr>
+      <w:r>
+        <w:rPr>
+          <w:rFonts w:ascii="Segoe UI Emoji" w:hAnsi="Segoe UI Emoji" w:cs="Segoe UI Emoji"/>
+          <w:sz w:val="44"/>
+          <w:szCs w:val="44"/>
+        </w:rPr>
+        <w:t>✅</w:t>
+      </w:r>
+    </w:p>
+    <w:p>
+      <w:pPr>
+        <w:pStyle w:val="Heading2"/>
+      </w:pPr>
+      <w:r>
+        <w:t>Kundens behov</w:t>
+      </w:r>
+    </w:p>
     <w:p/>
     <w:p>
       <w:pPr>
-        <w:pStyle w:val="Heading2"/>
-      </w:pPr>
-      <w:r>
-        <w:t>Kundens behov</w:t>
-      </w:r>
-    </w:p>
-    <w:p/>
-    <w:p>
-      <w:pPr>
         <w:rPr>
           <w:b/>
           <w:bCs/>
@@ -173,6 +190,27 @@
       <w:r>
         <w:t>anställd (den som använder utrustningen)</w:t>
       </w:r>
+    </w:p>
+    <w:p>
+      <w:pPr>
+        <w:rPr>
+          <w:sz w:val="44"/>
+          <w:szCs w:val="44"/>
+        </w:rPr>
+      </w:pPr>
+      <w:r>
+        <w:rPr>
+          <w:rFonts w:ascii="Segoe UI Emoji" w:hAnsi="Segoe UI Emoji" w:cs="Segoe UI Emoji"/>
+          <w:sz w:val="44"/>
+          <w:szCs w:val="44"/>
+        </w:rPr>
+        <w:t>✅</w:t>
+      </w:r>
+    </w:p>
+    <w:p>
+      <w:pPr>
+        <w:ind w:left="720"/>
+      </w:pPr>
     </w:p>
     <w:p/>
     <w:p>
@@ -258,6 +296,7 @@
         </w:numPr>
       </w:pPr>
       <w:r>
+        <w:lastRenderedPageBreak/>
         <w:t>Rumsnummer om status är ”i lager”</w:t>
       </w:r>
     </w:p>
@@ -272,20 +311,37 @@
         <w:t>“Hos [anställd]” om den är tilldelad</w:t>
       </w:r>
     </w:p>
+    <w:p>
+      <w:pPr>
+        <w:pStyle w:val="ListParagraph"/>
+        <w:rPr>
+          <w:sz w:val="44"/>
+          <w:szCs w:val="44"/>
+        </w:rPr>
+      </w:pPr>
+      <w:r>
+        <w:rPr>
+          <w:rFonts w:ascii="Segoe UI Emoji" w:hAnsi="Segoe UI Emoji" w:cs="Segoe UI Emoji"/>
+          <w:sz w:val="44"/>
+          <w:szCs w:val="44"/>
+        </w:rPr>
+        <w:t>✅</w:t>
+      </w:r>
+    </w:p>
     <w:p/>
-    <w:p>
-      <w:pPr>
-        <w:rPr>
-          <w:b/>
-          <w:bCs/>
-        </w:rPr>
-      </w:pPr>
-      <w:r>
-        <w:rPr>
-          <w:b/>
-          <w:bCs/>
-        </w:rPr>
-        <w:lastRenderedPageBreak/>
+    <w:p/>
+    <w:p>
+      <w:pPr>
+        <w:rPr>
+          <w:b/>
+          <w:bCs/>
+        </w:rPr>
+      </w:pPr>
+      <w:r>
+        <w:rPr>
+          <w:b/>
+          <w:bCs/>
+        </w:rPr>
         <w:t>3. Visa en detaljsida</w:t>
       </w:r>
     </w:p>
@@ -371,6 +427,22 @@
         <w:t>Kommentar</w:t>
       </w:r>
     </w:p>
+    <w:p>
+      <w:pPr>
+        <w:rPr>
+          <w:sz w:val="44"/>
+          <w:szCs w:val="44"/>
+        </w:rPr>
+      </w:pPr>
+      <w:r>
+        <w:rPr>
+          <w:rFonts w:ascii="Segoe UI Emoji" w:hAnsi="Segoe UI Emoji" w:cs="Segoe UI Emoji"/>
+          <w:sz w:val="44"/>
+          <w:szCs w:val="44"/>
+        </w:rPr>
+        <w:t>✅</w:t>
+      </w:r>
+    </w:p>
     <w:p/>
     <w:p>
       <w:pPr>
@@ -389,7 +461,23 @@
     </w:p>
     <w:p>
       <w:r>
-        <w:t>Endast en enkel adminroll behövs. Admin ska kunna:</w:t>
+        <w:t xml:space="preserve">Endast en enkel </w:t>
+      </w:r>
+      <w:proofErr w:type="spellStart"/>
+      <w:r>
+        <w:t>adminroll</w:t>
+      </w:r>
+      <w:proofErr w:type="spellEnd"/>
+      <w:r>
+        <w:t xml:space="preserve"> behövs. </w:t>
+      </w:r>
+      <w:proofErr w:type="spellStart"/>
+      <w:r>
+        <w:t>Admin</w:t>
+      </w:r>
+      <w:proofErr w:type="spellEnd"/>
+      <w:r>
+        <w:t xml:space="preserve"> ska kunna:</w:t>
       </w:r>
     </w:p>
     <w:p>
@@ -453,7 +541,15 @@
         </w:numPr>
       </w:pPr>
       <w:r>
-        <w:t>Tilldela utrustning till en anställd (drop-down räcker)</w:t>
+        <w:t>Tilldela utrustning till en anställd (</w:t>
+      </w:r>
+      <w:proofErr w:type="spellStart"/>
+      <w:r>
+        <w:t>drop</w:t>
+      </w:r>
+      <w:proofErr w:type="spellEnd"/>
+      <w:r>
+        <w:t>-down räcker)</w:t>
       </w:r>
     </w:p>
     <w:p>
@@ -507,7 +603,15 @@
         </w:numPr>
       </w:pPr>
       <w:r>
-        <w:t>Fungerar på både mobil och dator (grundresponsivitet)</w:t>
+        <w:t>Fungerar på både mobil och dator (</w:t>
+      </w:r>
+      <w:proofErr w:type="spellStart"/>
+      <w:r>
+        <w:t>grundresponsivitet</w:t>
+      </w:r>
+      <w:proofErr w:type="spellEnd"/>
+      <w:r>
+        <w:t>)</w:t>
       </w:r>
     </w:p>
     <w:p>
@@ -518,8 +622,21 @@
         </w:numPr>
       </w:pPr>
       <w:r>
-        <w:t>Enkel lösenordsskyddad admininloggning</w:t>
-      </w:r>
+        <w:t xml:space="preserve">Enkel </w:t>
+      </w:r>
+      <w:proofErr w:type="spellStart"/>
+      <w:r>
+        <w:t>lösenordsskyddad</w:t>
+      </w:r>
+      <w:proofErr w:type="spellEnd"/>
+      <w:r>
+        <w:t xml:space="preserve"> </w:t>
+      </w:r>
+      <w:proofErr w:type="spellStart"/>
+      <w:r>
+        <w:t>admininloggning</w:t>
+      </w:r>
+      <w:proofErr w:type="spellEnd"/>
     </w:p>
     <w:p/>
     <w:p>
@@ -582,6 +699,7 @@
           <w:numId w:val="7"/>
         </w:numPr>
       </w:pPr>
+      <w:proofErr w:type="spellStart"/>
       <w:r>
         <w:rPr>
           <w:b/>
@@ -589,6 +707,7 @@
         </w:rPr>
         <w:t>Wireframes</w:t>
       </w:r>
+      <w:proofErr w:type="spellEnd"/>
       <w:r>
         <w:t xml:space="preserve"> för:</w:t>
       </w:r>
@@ -622,9 +741,13 @@
           <w:numId w:val="7"/>
         </w:numPr>
       </w:pPr>
-      <w:r>
-        <w:lastRenderedPageBreak/>
-        <w:t>Adminsidor för utrustning och anställda</w:t>
+      <w:proofErr w:type="spellStart"/>
+      <w:r>
+        <w:t>Adminsidor</w:t>
+      </w:r>
+      <w:proofErr w:type="spellEnd"/>
+      <w:r>
+        <w:t xml:space="preserve"> för utrustning och anställda</w:t>
       </w:r>
     </w:p>
     <w:p>
@@ -810,8 +933,13 @@
           <w:numId w:val="9"/>
         </w:numPr>
       </w:pPr>
-      <w:r>
-        <w:t>anstalld_id (FK – 0 = ingen tilldelad)</w:t>
+      <w:proofErr w:type="spellStart"/>
+      <w:r>
+        <w:t>anstalld_id</w:t>
+      </w:r>
+      <w:proofErr w:type="spellEnd"/>
+      <w:r>
+        <w:t xml:space="preserve"> (FK – 0 = ingen tilldelad)</w:t>
       </w:r>
     </w:p>
     <w:p>
@@ -860,7 +988,25 @@
           <w:bCs/>
           <w:color w:val="FF0000"/>
         </w:rPr>
-        <w:t>Tabell: Admin (valfritt – eller hårdkodad användare)</w:t>
+        <w:t xml:space="preserve">Tabell: </w:t>
+      </w:r>
+      <w:proofErr w:type="spellStart"/>
+      <w:r>
+        <w:rPr>
+          <w:b/>
+          <w:bCs/>
+          <w:color w:val="FF0000"/>
+        </w:rPr>
+        <w:t>Admin</w:t>
+      </w:r>
+      <w:proofErr w:type="spellEnd"/>
+      <w:r>
+        <w:rPr>
+          <w:b/>
+          <w:bCs/>
+          <w:color w:val="FF0000"/>
+        </w:rPr>
+        <w:t xml:space="preserve"> (valfritt – eller hårdkodad användare)</w:t>
       </w:r>
     </w:p>
     <w:p>
@@ -925,11 +1071,26 @@
         <w:rPr>
           <w:color w:val="000000" w:themeColor="text1"/>
         </w:rPr>
-        <w:t>Denna behövs inte om man använder loginsystemet som botten!</w:t>
-      </w:r>
-    </w:p>
-    <w:p>
-      <w:r>
+        <w:t xml:space="preserve">Denna behövs inte om man använder </w:t>
+      </w:r>
+      <w:proofErr w:type="spellStart"/>
+      <w:r>
+        <w:rPr>
+          <w:color w:val="000000" w:themeColor="text1"/>
+        </w:rPr>
+        <w:t>loginsystemet</w:t>
+      </w:r>
+      <w:proofErr w:type="spellEnd"/>
+      <w:r>
+        <w:rPr>
+          <w:color w:val="000000" w:themeColor="text1"/>
+        </w:rPr>
+        <w:t xml:space="preserve"> som botten!</w:t>
+      </w:r>
+    </w:p>
+    <w:p>
+      <w:r>
+        <w:lastRenderedPageBreak/>
         <w:t>Relation:</w:t>
       </w:r>
       <w:r>
@@ -950,7 +1111,23 @@
           <w:b/>
           <w:bCs/>
         </w:rPr>
-        <w:t>Utrustning kan stå i lager och har då rumsnummer istället för anställd.</w:t>
+        <w:t xml:space="preserve">Utrustning kan stå i lager och har då rumsnummer </w:t>
+      </w:r>
+      <w:proofErr w:type="gramStart"/>
+      <w:r>
+        <w:rPr>
+          <w:b/>
+          <w:bCs/>
+        </w:rPr>
+        <w:t>istället</w:t>
+      </w:r>
+      <w:proofErr w:type="gramEnd"/>
+      <w:r>
+        <w:rPr>
+          <w:b/>
+          <w:bCs/>
+        </w:rPr>
+        <w:t xml:space="preserve"> för anställd.</w:t>
       </w:r>
     </w:p>
     <w:p/>
@@ -1072,8 +1249,13 @@
           <w:numId w:val="11"/>
         </w:numPr>
       </w:pPr>
-      <w:r>
-        <w:t>Admin: lista, skapa, redigera, radera utrustning</w:t>
+      <w:proofErr w:type="spellStart"/>
+      <w:r>
+        <w:t>Admin</w:t>
+      </w:r>
+      <w:proofErr w:type="spellEnd"/>
+      <w:r>
+        <w:t>: lista, skapa, redigera, radera utrustning</w:t>
       </w:r>
     </w:p>
     <w:p>
@@ -1083,8 +1265,13 @@
           <w:numId w:val="11"/>
         </w:numPr>
       </w:pPr>
-      <w:r>
-        <w:t>Admin: lista, skapa, redigera, radera anställda</w:t>
+      <w:proofErr w:type="spellStart"/>
+      <w:r>
+        <w:t>Admin</w:t>
+      </w:r>
+      <w:proofErr w:type="spellEnd"/>
+      <w:r>
+        <w:t>: lista, skapa, redigera, radera anställda</w:t>
       </w:r>
     </w:p>
     <w:p>
@@ -1176,7 +1363,15 @@
         </w:numPr>
       </w:pPr>
       <w:r>
-        <w:t>Tilldela utrustning → anstalld_id sätts</w:t>
+        <w:t xml:space="preserve">Tilldela utrustning → </w:t>
+      </w:r>
+      <w:proofErr w:type="spellStart"/>
+      <w:r>
+        <w:t>anstalld_id</w:t>
+      </w:r>
+      <w:proofErr w:type="spellEnd"/>
+      <w:r>
+        <w:t xml:space="preserve"> sätts</w:t>
       </w:r>
     </w:p>
     <w:p>
@@ -1187,8 +1382,13 @@
         </w:numPr>
       </w:pPr>
       <w:r>
-        <w:t>Om status = “i lager” → rumsnummer används istället</w:t>
-      </w:r>
+        <w:t xml:space="preserve">Om status = “i lager” → rumsnummer används </w:t>
+      </w:r>
+      <w:proofErr w:type="gramStart"/>
+      <w:r>
+        <w:t>istället</w:t>
+      </w:r>
+      <w:proofErr w:type="gramEnd"/>
     </w:p>
     <w:p>
       <w:pPr>
@@ -1218,8 +1418,13 @@
         </w:numPr>
       </w:pPr>
       <w:r>
-        <w:t>5 tydliga commits</w:t>
-      </w:r>
+        <w:t xml:space="preserve">5 tydliga </w:t>
+      </w:r>
+      <w:proofErr w:type="spellStart"/>
+      <w:r>
+        <w:t>commits</w:t>
+      </w:r>
+      <w:proofErr w:type="spellEnd"/>
     </w:p>
     <w:p>
       <w:pPr>
@@ -1231,9 +1436,27 @@
       <w:r>
         <w:t xml:space="preserve">1 </w:t>
       </w:r>
-      <w:r>
-        <w:t>brasch + merge med main</w:t>
-      </w:r>
+      <w:proofErr w:type="spellStart"/>
+      <w:r>
+        <w:t>brasch</w:t>
+      </w:r>
+      <w:proofErr w:type="spellEnd"/>
+      <w:r>
+        <w:t xml:space="preserve"> + </w:t>
+      </w:r>
+      <w:proofErr w:type="spellStart"/>
+      <w:r>
+        <w:t>merge</w:t>
+      </w:r>
+      <w:proofErr w:type="spellEnd"/>
+      <w:r>
+        <w:t xml:space="preserve"> med </w:t>
+      </w:r>
+      <w:proofErr w:type="spellStart"/>
+      <w:r>
+        <w:t>main</w:t>
+      </w:r>
+      <w:proofErr w:type="spellEnd"/>
     </w:p>
     <w:p/>
     <w:p>
@@ -1253,6 +1476,7 @@
     </w:p>
     <w:p>
       <w:r>
+        <w:lastRenderedPageBreak/>
         <w:t>Eleven testar kort:</w:t>
       </w:r>
     </w:p>
@@ -1330,279 +1554,299 @@
         </w:numPr>
       </w:pPr>
       <w:r>
-        <w:t>Enkel mobilvy</w:t>
-      </w:r>
-    </w:p>
-    <w:p>
+        <w:t xml:space="preserve">Enkel </w:t>
+      </w:r>
+      <w:proofErr w:type="spellStart"/>
+      <w:r>
+        <w:t>mobilvy</w:t>
+      </w:r>
+      <w:proofErr w:type="spellEnd"/>
+    </w:p>
+    <w:p>
+      <w:r>
+        <w:t>En kort testrapport</w:t>
+      </w:r>
+    </w:p>
+    <w:p/>
+    <w:p>
+      <w:pPr>
+        <w:rPr>
+          <w:b/>
+          <w:bCs/>
+        </w:rPr>
+      </w:pPr>
+      <w:r>
+        <w:rPr>
+          <w:b/>
+          <w:bCs/>
+        </w:rPr>
+        <w:t>5. Avslutning</w:t>
+      </w:r>
+    </w:p>
+    <w:p>
+      <w:pPr>
+        <w:numPr>
+          <w:ilvl w:val="0"/>
+          <w:numId w:val="15"/>
+        </w:numPr>
+      </w:pPr>
+      <w:r>
+        <w:t>Kort presentation/demonstration för “kunden” (</w:t>
+      </w:r>
+      <w:proofErr w:type="spellStart"/>
+      <w:r>
+        <w:t>läraren</w:t>
+      </w:r>
+      <w:r>
+        <w:t>+utomstående</w:t>
+      </w:r>
+      <w:proofErr w:type="spellEnd"/>
+      <w:r>
+        <w:t xml:space="preserve"> bedömare</w:t>
+      </w:r>
+      <w:r>
+        <w:t>)</w:t>
+      </w:r>
+    </w:p>
+    <w:p/>
+    <w:p>
+      <w:pPr>
+        <w:rPr>
+          <w:b/>
+          <w:bCs/>
+        </w:rPr>
+      </w:pPr>
+      <w:r>
+        <w:rPr>
+          <w:b/>
+          <w:bCs/>
+        </w:rPr>
+        <w:t>Bedömningskriterier (förenklade)</w:t>
+      </w:r>
+    </w:p>
+    <w:p>
+      <w:pPr>
+        <w:rPr>
+          <w:b/>
+          <w:bCs/>
+        </w:rPr>
+      </w:pPr>
+      <w:r>
+        <w:rPr>
+          <w:b/>
+          <w:bCs/>
+        </w:rPr>
+        <w:t>Kommunikation</w:t>
+      </w:r>
+    </w:p>
+    <w:p>
+      <w:pPr>
+        <w:numPr>
+          <w:ilvl w:val="0"/>
+          <w:numId w:val="16"/>
+        </w:numPr>
+      </w:pPr>
+      <w:r>
+        <w:t>Förklarar systemet för kunden</w:t>
+      </w:r>
+    </w:p>
+    <w:p>
+      <w:pPr>
+        <w:numPr>
+          <w:ilvl w:val="0"/>
+          <w:numId w:val="16"/>
+        </w:numPr>
+      </w:pPr>
+      <w:r>
+        <w:t>Svarar på frågorna</w:t>
+      </w:r>
+    </w:p>
+    <w:p>
+      <w:pPr>
+        <w:rPr>
+          <w:b/>
+          <w:bCs/>
+        </w:rPr>
+      </w:pPr>
+      <w:r>
+        <w:rPr>
+          <w:b/>
+          <w:bCs/>
+        </w:rPr>
+        <w:t>Planering</w:t>
+      </w:r>
+    </w:p>
+    <w:p>
+      <w:pPr>
+        <w:numPr>
+          <w:ilvl w:val="0"/>
+          <w:numId w:val="17"/>
+        </w:numPr>
+      </w:pPr>
+      <w:r>
+        <w:t>Tidsplan</w:t>
+      </w:r>
+    </w:p>
+    <w:p>
+      <w:pPr>
+        <w:numPr>
+          <w:ilvl w:val="0"/>
+          <w:numId w:val="17"/>
+        </w:numPr>
+      </w:pPr>
+      <w:proofErr w:type="spellStart"/>
+      <w:r>
+        <w:t>Wireframes</w:t>
+      </w:r>
+      <w:proofErr w:type="spellEnd"/>
+    </w:p>
+    <w:p>
+      <w:pPr>
+        <w:numPr>
+          <w:ilvl w:val="0"/>
+          <w:numId w:val="17"/>
+        </w:numPr>
+      </w:pPr>
+      <w:r>
+        <w:t>Funktionslista</w:t>
+      </w:r>
+    </w:p>
+    <w:p>
+      <w:pPr>
+        <w:numPr>
+          <w:ilvl w:val="0"/>
+          <w:numId w:val="17"/>
+        </w:numPr>
+      </w:pPr>
+      <w:r>
+        <w:t>Databasstruktur</w:t>
+      </w:r>
+    </w:p>
+    <w:p>
+      <w:pPr>
+        <w:rPr>
+          <w:b/>
+          <w:bCs/>
+        </w:rPr>
+      </w:pPr>
+      <w:r>
+        <w:rPr>
+          <w:b/>
+          <w:bCs/>
+        </w:rPr>
+        <w:t>Utveckling</w:t>
+      </w:r>
+    </w:p>
+    <w:p>
+      <w:pPr>
+        <w:numPr>
+          <w:ilvl w:val="0"/>
+          <w:numId w:val="18"/>
+        </w:numPr>
+      </w:pPr>
+      <w:r>
+        <w:t>Databas fungerar</w:t>
+      </w:r>
+    </w:p>
+    <w:p>
+      <w:pPr>
+        <w:numPr>
+          <w:ilvl w:val="0"/>
+          <w:numId w:val="18"/>
+        </w:numPr>
+      </w:pPr>
+      <w:r>
+        <w:t>Utrustning och anställda kan hanteras</w:t>
+      </w:r>
+    </w:p>
+    <w:p>
+      <w:pPr>
+        <w:numPr>
+          <w:ilvl w:val="0"/>
+          <w:numId w:val="18"/>
+        </w:numPr>
+      </w:pPr>
+      <w:r>
+        <w:t>Sökning fungerar</w:t>
+      </w:r>
+    </w:p>
+    <w:p>
+      <w:pPr>
+        <w:numPr>
+          <w:ilvl w:val="0"/>
+          <w:numId w:val="18"/>
+        </w:numPr>
+      </w:pPr>
+      <w:r>
+        <w:t>Grundläggande säkerhet (lösenord) fungerar</w:t>
+      </w:r>
+    </w:p>
+    <w:p>
+      <w:pPr>
+        <w:rPr>
+          <w:b/>
+          <w:bCs/>
+        </w:rPr>
+      </w:pPr>
+      <w:r>
+        <w:rPr>
+          <w:b/>
+          <w:bCs/>
+        </w:rPr>
+        <w:t>Versionshantering</w:t>
+      </w:r>
+    </w:p>
+    <w:p>
+      <w:pPr>
+        <w:numPr>
+          <w:ilvl w:val="0"/>
+          <w:numId w:val="19"/>
+        </w:numPr>
+      </w:pPr>
+      <w:r>
+        <w:t xml:space="preserve">Flera </w:t>
+      </w:r>
+      <w:proofErr w:type="spellStart"/>
+      <w:r>
+        <w:t>commits</w:t>
+      </w:r>
+      <w:proofErr w:type="spellEnd"/>
+    </w:p>
+    <w:p>
+      <w:pPr>
+        <w:numPr>
+          <w:ilvl w:val="0"/>
+          <w:numId w:val="19"/>
+        </w:numPr>
+      </w:pPr>
+      <w:r>
+        <w:t>Grundläggande förståelse</w:t>
+      </w:r>
+    </w:p>
+    <w:p>
+      <w:pPr>
+        <w:rPr>
+          <w:b/>
+          <w:bCs/>
+        </w:rPr>
+      </w:pPr>
+      <w:r>
+        <w:rPr>
+          <w:b/>
+          <w:bCs/>
+        </w:rPr>
+        <w:t>Presentation</w:t>
+      </w:r>
+    </w:p>
+    <w:p>
+      <w:pPr>
+        <w:numPr>
+          <w:ilvl w:val="0"/>
+          <w:numId w:val="20"/>
+        </w:numPr>
+      </w:pPr>
       <w:r>
         <w:lastRenderedPageBreak/>
-        <w:t>En kort testrapport</w:t>
-      </w:r>
-    </w:p>
-    <w:p/>
-    <w:p>
-      <w:pPr>
-        <w:rPr>
-          <w:b/>
-          <w:bCs/>
-        </w:rPr>
-      </w:pPr>
-      <w:r>
-        <w:rPr>
-          <w:b/>
-          <w:bCs/>
-        </w:rPr>
-        <w:t>5. Avslutning</w:t>
-      </w:r>
-    </w:p>
-    <w:p>
-      <w:pPr>
-        <w:numPr>
-          <w:ilvl w:val="0"/>
-          <w:numId w:val="15"/>
-        </w:numPr>
-      </w:pPr>
-      <w:r>
-        <w:t>Kort presentation/demonstration för “kunden” (läraren</w:t>
-      </w:r>
-      <w:r>
-        <w:t>+utomstående bedömare</w:t>
-      </w:r>
-      <w:r>
-        <w:t>)</w:t>
-      </w:r>
-    </w:p>
-    <w:p/>
-    <w:p>
-      <w:pPr>
-        <w:rPr>
-          <w:b/>
-          <w:bCs/>
-        </w:rPr>
-      </w:pPr>
-      <w:r>
-        <w:rPr>
-          <w:b/>
-          <w:bCs/>
-        </w:rPr>
-        <w:t>Bedömningskriterier (förenklade)</w:t>
-      </w:r>
-    </w:p>
-    <w:p>
-      <w:pPr>
-        <w:rPr>
-          <w:b/>
-          <w:bCs/>
-        </w:rPr>
-      </w:pPr>
-      <w:r>
-        <w:rPr>
-          <w:b/>
-          <w:bCs/>
-        </w:rPr>
-        <w:t>Kommunikation</w:t>
-      </w:r>
-    </w:p>
-    <w:p>
-      <w:pPr>
-        <w:numPr>
-          <w:ilvl w:val="0"/>
-          <w:numId w:val="16"/>
-        </w:numPr>
-      </w:pPr>
-      <w:r>
-        <w:t>Förklarar systemet för kunden</w:t>
-      </w:r>
-    </w:p>
-    <w:p>
-      <w:pPr>
-        <w:numPr>
-          <w:ilvl w:val="0"/>
-          <w:numId w:val="16"/>
-        </w:numPr>
-      </w:pPr>
-      <w:r>
-        <w:t>Svarar på frågorna</w:t>
-      </w:r>
-    </w:p>
-    <w:p>
-      <w:pPr>
-        <w:rPr>
-          <w:b/>
-          <w:bCs/>
-        </w:rPr>
-      </w:pPr>
-      <w:r>
-        <w:rPr>
-          <w:b/>
-          <w:bCs/>
-        </w:rPr>
-        <w:t>Planering</w:t>
-      </w:r>
-    </w:p>
-    <w:p>
-      <w:pPr>
-        <w:numPr>
-          <w:ilvl w:val="0"/>
-          <w:numId w:val="17"/>
-        </w:numPr>
-      </w:pPr>
-      <w:r>
-        <w:t>Tidsplan</w:t>
-      </w:r>
-    </w:p>
-    <w:p>
-      <w:pPr>
-        <w:numPr>
-          <w:ilvl w:val="0"/>
-          <w:numId w:val="17"/>
-        </w:numPr>
-      </w:pPr>
-      <w:r>
-        <w:t>Wireframes</w:t>
-      </w:r>
-    </w:p>
-    <w:p>
-      <w:pPr>
-        <w:numPr>
-          <w:ilvl w:val="0"/>
-          <w:numId w:val="17"/>
-        </w:numPr>
-      </w:pPr>
-      <w:r>
-        <w:t>Funktionslista</w:t>
-      </w:r>
-    </w:p>
-    <w:p>
-      <w:pPr>
-        <w:numPr>
-          <w:ilvl w:val="0"/>
-          <w:numId w:val="17"/>
-        </w:numPr>
-      </w:pPr>
-      <w:r>
-        <w:t>Databasstruktur</w:t>
-      </w:r>
-    </w:p>
-    <w:p>
-      <w:pPr>
-        <w:rPr>
-          <w:b/>
-          <w:bCs/>
-        </w:rPr>
-      </w:pPr>
-      <w:r>
-        <w:rPr>
-          <w:b/>
-          <w:bCs/>
-        </w:rPr>
-        <w:t>Utveckling</w:t>
-      </w:r>
-    </w:p>
-    <w:p>
-      <w:pPr>
-        <w:numPr>
-          <w:ilvl w:val="0"/>
-          <w:numId w:val="18"/>
-        </w:numPr>
-      </w:pPr>
-      <w:r>
-        <w:t>Databas fungerar</w:t>
-      </w:r>
-    </w:p>
-    <w:p>
-      <w:pPr>
-        <w:numPr>
-          <w:ilvl w:val="0"/>
-          <w:numId w:val="18"/>
-        </w:numPr>
-      </w:pPr>
-      <w:r>
-        <w:t>Utrustning och anställda kan hanteras</w:t>
-      </w:r>
-    </w:p>
-    <w:p>
-      <w:pPr>
-        <w:numPr>
-          <w:ilvl w:val="0"/>
-          <w:numId w:val="18"/>
-        </w:numPr>
-      </w:pPr>
-      <w:r>
-        <w:t>Sökning fungerar</w:t>
-      </w:r>
-    </w:p>
-    <w:p>
-      <w:pPr>
-        <w:numPr>
-          <w:ilvl w:val="0"/>
-          <w:numId w:val="18"/>
-        </w:numPr>
-      </w:pPr>
-      <w:r>
-        <w:t>Grundläggande säkerhet (lösenord) fungerar</w:t>
-      </w:r>
-    </w:p>
-    <w:p>
-      <w:pPr>
-        <w:rPr>
-          <w:b/>
-          <w:bCs/>
-        </w:rPr>
-      </w:pPr>
-      <w:r>
-        <w:rPr>
-          <w:b/>
-          <w:bCs/>
-        </w:rPr>
-        <w:t>Versionshantering</w:t>
-      </w:r>
-    </w:p>
-    <w:p>
-      <w:pPr>
-        <w:numPr>
-          <w:ilvl w:val="0"/>
-          <w:numId w:val="19"/>
-        </w:numPr>
-      </w:pPr>
-      <w:r>
-        <w:t>Flera commits</w:t>
-      </w:r>
-    </w:p>
-    <w:p>
-      <w:pPr>
-        <w:numPr>
-          <w:ilvl w:val="0"/>
-          <w:numId w:val="19"/>
-        </w:numPr>
-      </w:pPr>
-      <w:r>
-        <w:t>Grundläggande förståelse</w:t>
-      </w:r>
-    </w:p>
-    <w:p>
-      <w:pPr>
-        <w:rPr>
-          <w:b/>
-          <w:bCs/>
-        </w:rPr>
-      </w:pPr>
-      <w:r>
-        <w:rPr>
-          <w:b/>
-          <w:bCs/>
-        </w:rPr>
-        <w:t>Presentation</w:t>
-      </w:r>
-    </w:p>
-    <w:p>
-      <w:pPr>
-        <w:numPr>
-          <w:ilvl w:val="0"/>
-          <w:numId w:val="20"/>
-        </w:numPr>
-      </w:pPr>
-      <w:r>
         <w:t>Systemet funkar</w:t>
       </w:r>
       <w:r>
@@ -5074,6 +5318,7 @@
   <w:style w:type="paragraph" w:default="1" w:styleId="Normal">
     <w:name w:val="Normal"/>
     <w:qFormat/>
+    <w:rsid w:val="00AB4EA6"/>
   </w:style>
   <w:style w:type="paragraph" w:styleId="Heading1">
     <w:name w:val="heading 1"/>
@@ -5276,7 +5521,6 @@
   <w:style w:type="character" w:default="1" w:styleId="DefaultParagraphFont">
     <w:name w:val="Default Paragraph Font"/>
     <w:uiPriority w:val="1"/>
-    <w:semiHidden/>
     <w:unhideWhenUsed/>
   </w:style>
   <w:style w:type="table" w:default="1" w:styleId="TableNormal">

</xml_diff>